<commit_message>
Remove question 2.1 from answer document
</commit_message>
<xml_diff>
--- a/TH-Programming_Skill_Tests_1_Answers.docx
+++ b/TH-Programming_Skill_Tests_1_Answers.docx
@@ -302,60 +302,7 @@
         <w:pStyle w:val="Heading2"/>
       </w:pPr>
       <w:r>
-        <w:t>2.1 วิเคราะห์ Code หรือ Logic</w:t>
-      </w:r>
-    </w:p>
-    <w:p>
-      <w:r>
-        <w:t>แนวทางตอบตอนสัมภาษณ์: ไล่ input -&gt; process -&gt; output แล้วหาจุดผิดหรือจุดเสี่ยงอย่างน้อย 3 จุด</w:t>
-      </w:r>
-    </w:p>
-    <w:p>
-      <w:pPr>
-        <w:pStyle w:val="ListBullet"/>
-      </w:pPr>
-      <w:r>
-        <w:t>Input validation ไม่ครบ เช่น ไม่ตรวจค่าว่าง type หรือ range</w:t>
-      </w:r>
-    </w:p>
-    <w:p>
-      <w:pPr>
-        <w:pStyle w:val="ListBullet"/>
-      </w:pPr>
-      <w:r>
-        <w:t>Boundary condition ผิด เช่น วันพฤหัส/ศุกร์ หรือยอดมัดจำ 999/1000</w:t>
-      </w:r>
-    </w:p>
-    <w:p>
-      <w:pPr>
-        <w:pStyle w:val="ListBullet"/>
-      </w:pPr>
-      <w:r>
-        <w:t>Business rule กระจายหลายจุด ทำให้แก้ไขยากและเกิด bug ง่าย</w:t>
-      </w:r>
-    </w:p>
-    <w:p>
-      <w:pPr>
-        <w:pStyle w:val="ListBullet"/>
-      </w:pPr>
-      <w:r>
-        <w:t>Security risk เช่น SQL injection หรือรับ input โดยไม่ sanitize</w:t>
-      </w:r>
-    </w:p>
-    <w:p>
-      <w:pPr>
-        <w:pStyle w:val="ListBullet"/>
-      </w:pPr>
-      <w:r>
-        <w:t>Error handling ไม่ชัดเจน ทำให้ข้อมูลค้างครึ่งทางได้</w:t>
-      </w:r>
-    </w:p>
-    <w:p>
-      <w:pPr>
-        <w:pStyle w:val="Heading2"/>
-      </w:pPr>
-      <w:r>
-        <w:t>2.2 Prompt ให้ AI เขียน Code ระบบจองโต๊ะร้านอาหาร</w:t>
+        <w:t>2. Prompt ให้ AI เขียน Code ระบบจองโต๊ะร้านอาหาร</w:t>
       </w:r>
     </w:p>
     <w:p>

</xml_diff>